<commit_message>
updated also angular 21
</commit_message>
<xml_diff>
--- a/New feature angular above17.docx
+++ b/New feature angular above17.docx
@@ -9027,8 +9027,6 @@
             </w:r>
           </w:p>
         </w:tc>
-        <w:bookmarkStart w:id="0" w:name="_GoBack"/>
-        <w:bookmarkEnd w:id="0"/>
       </w:tr>
       <w:tr>
         <w:trPr>
@@ -10398,6 +10396,1466 @@
     </w:tbl>
     <w:p>
       <w:pPr>
+        <w:spacing w:before="100" w:beforeAutospacing="1" w:after="100" w:afterAutospacing="1" w:line="240" w:lineRule="auto"/>
+        <w:rPr>
+          <w:rFonts w:ascii="Times New Roman" w:eastAsia="Times New Roman" w:hAnsi="Times New Roman" w:cs="Times New Roman"/>
+          <w:sz w:val="24"/>
+          <w:szCs w:val="24"/>
+          <w:lang w:eastAsia="en-IN"/>
+        </w:rPr>
+      </w:pPr>
+      <w:r>
+        <w:rPr>
+          <w:rFonts w:ascii="Times New Roman" w:eastAsia="Times New Roman" w:hAnsi="Times New Roman" w:cs="Times New Roman"/>
+          <w:sz w:val="24"/>
+          <w:szCs w:val="24"/>
+          <w:lang w:eastAsia="en-IN"/>
+        </w:rPr>
+        <w:t>Main features:</w:t>
+      </w:r>
+    </w:p>
+    <w:tbl>
+      <w:tblPr>
+        <w:tblW w:w="0" w:type="auto"/>
+        <w:tblCellSpacing w:w="15" w:type="dxa"/>
+        <w:tblCellMar>
+          <w:top w:w="15" w:type="dxa"/>
+          <w:left w:w="15" w:type="dxa"/>
+          <w:bottom w:w="15" w:type="dxa"/>
+          <w:right w:w="15" w:type="dxa"/>
+        </w:tblCellMar>
+        <w:tblLook w:val="04A0" w:firstRow="1" w:lastRow="0" w:firstColumn="1" w:lastColumn="0" w:noHBand="0" w:noVBand="1"/>
+      </w:tblPr>
+      <w:tblGrid>
+        <w:gridCol w:w="2203"/>
+        <w:gridCol w:w="1898"/>
+      </w:tblGrid>
+      <w:tr>
+        <w:trPr>
+          <w:tblHeader/>
+          <w:tblCellSpacing w:w="15" w:type="dxa"/>
+        </w:trPr>
+        <w:tc>
+          <w:tcPr>
+            <w:tcW w:w="0" w:type="auto"/>
+            <w:vAlign w:val="center"/>
+            <w:hideMark/>
+          </w:tcPr>
+          <w:p>
+            <w:pPr>
+              <w:spacing w:after="0" w:line="240" w:lineRule="auto"/>
+              <w:jc w:val="center"/>
+              <w:rPr>
+                <w:rFonts w:ascii="Times New Roman" w:eastAsia="Times New Roman" w:hAnsi="Times New Roman" w:cs="Times New Roman"/>
+                <w:b/>
+                <w:bCs/>
+                <w:sz w:val="24"/>
+                <w:szCs w:val="24"/>
+                <w:lang w:eastAsia="en-IN"/>
+              </w:rPr>
+            </w:pPr>
+            <w:r>
+              <w:rPr>
+                <w:rFonts w:ascii="Times New Roman" w:eastAsia="Times New Roman" w:hAnsi="Times New Roman" w:cs="Times New Roman"/>
+                <w:b/>
+                <w:bCs/>
+                <w:sz w:val="24"/>
+                <w:szCs w:val="24"/>
+                <w:lang w:eastAsia="en-IN"/>
+              </w:rPr>
+              <w:t>Feature</w:t>
+            </w:r>
+          </w:p>
+        </w:tc>
+        <w:tc>
+          <w:tcPr>
+            <w:tcW w:w="0" w:type="auto"/>
+            <w:vAlign w:val="center"/>
+            <w:hideMark/>
+          </w:tcPr>
+          <w:p>
+            <w:pPr>
+              <w:spacing w:after="0" w:line="240" w:lineRule="auto"/>
+              <w:jc w:val="center"/>
+              <w:rPr>
+                <w:rFonts w:ascii="Times New Roman" w:eastAsia="Times New Roman" w:hAnsi="Times New Roman" w:cs="Times New Roman"/>
+                <w:b/>
+                <w:bCs/>
+                <w:sz w:val="24"/>
+                <w:szCs w:val="24"/>
+                <w:lang w:eastAsia="en-IN"/>
+              </w:rPr>
+            </w:pPr>
+            <w:r>
+              <w:rPr>
+                <w:rFonts w:ascii="Times New Roman" w:eastAsia="Times New Roman" w:hAnsi="Times New Roman" w:cs="Times New Roman"/>
+                <w:b/>
+                <w:bCs/>
+                <w:sz w:val="24"/>
+                <w:szCs w:val="24"/>
+                <w:lang w:eastAsia="en-IN"/>
+              </w:rPr>
+              <w:t>Replaces</w:t>
+            </w:r>
+          </w:p>
+        </w:tc>
+      </w:tr>
+      <w:tr>
+        <w:trPr>
+          <w:tblCellSpacing w:w="15" w:type="dxa"/>
+        </w:trPr>
+        <w:tc>
+          <w:tcPr>
+            <w:tcW w:w="0" w:type="auto"/>
+            <w:vAlign w:val="center"/>
+            <w:hideMark/>
+          </w:tcPr>
+          <w:p>
+            <w:pPr>
+              <w:spacing w:after="0" w:line="240" w:lineRule="auto"/>
+              <w:rPr>
+                <w:rFonts w:eastAsia="Times New Roman" w:cstheme="minorHAnsi"/>
+                <w:sz w:val="20"/>
+                <w:szCs w:val="20"/>
+                <w:lang w:eastAsia="en-IN"/>
+              </w:rPr>
+            </w:pPr>
+            <w:r>
+              <w:rPr>
+                <w:rFonts w:eastAsia="Times New Roman" w:cstheme="minorHAnsi"/>
+                <w:sz w:val="20"/>
+                <w:szCs w:val="20"/>
+                <w:lang w:eastAsia="en-IN"/>
+              </w:rPr>
+              <w:t>@if</w:t>
+            </w:r>
+          </w:p>
+        </w:tc>
+        <w:tc>
+          <w:tcPr>
+            <w:tcW w:w="0" w:type="auto"/>
+            <w:vAlign w:val="center"/>
+            <w:hideMark/>
+          </w:tcPr>
+          <w:p>
+            <w:pPr>
+              <w:spacing w:after="0" w:line="240" w:lineRule="auto"/>
+              <w:rPr>
+                <w:rFonts w:eastAsia="Times New Roman" w:cstheme="minorHAnsi"/>
+                <w:sz w:val="20"/>
+                <w:szCs w:val="20"/>
+                <w:lang w:eastAsia="en-IN"/>
+              </w:rPr>
+            </w:pPr>
+            <w:r>
+              <w:rPr>
+                <w:rFonts w:eastAsia="Times New Roman" w:cstheme="minorHAnsi"/>
+                <w:sz w:val="20"/>
+                <w:szCs w:val="20"/>
+                <w:lang w:eastAsia="en-IN"/>
+              </w:rPr>
+              <w:t>*ngIf</w:t>
+            </w:r>
+          </w:p>
+        </w:tc>
+      </w:tr>
+      <w:tr>
+        <w:trPr>
+          <w:tblCellSpacing w:w="15" w:type="dxa"/>
+        </w:trPr>
+        <w:tc>
+          <w:tcPr>
+            <w:tcW w:w="0" w:type="auto"/>
+            <w:vAlign w:val="center"/>
+            <w:hideMark/>
+          </w:tcPr>
+          <w:p>
+            <w:pPr>
+              <w:spacing w:after="0" w:line="240" w:lineRule="auto"/>
+              <w:rPr>
+                <w:rFonts w:eastAsia="Times New Roman" w:cstheme="minorHAnsi"/>
+                <w:sz w:val="20"/>
+                <w:szCs w:val="20"/>
+                <w:lang w:eastAsia="en-IN"/>
+              </w:rPr>
+            </w:pPr>
+            <w:r>
+              <w:rPr>
+                <w:rFonts w:eastAsia="Times New Roman" w:cstheme="minorHAnsi"/>
+                <w:sz w:val="20"/>
+                <w:szCs w:val="20"/>
+                <w:lang w:eastAsia="en-IN"/>
+              </w:rPr>
+              <w:t>@for</w:t>
+            </w:r>
+          </w:p>
+        </w:tc>
+        <w:tc>
+          <w:tcPr>
+            <w:tcW w:w="0" w:type="auto"/>
+            <w:vAlign w:val="center"/>
+            <w:hideMark/>
+          </w:tcPr>
+          <w:p>
+            <w:pPr>
+              <w:spacing w:after="0" w:line="240" w:lineRule="auto"/>
+              <w:rPr>
+                <w:rFonts w:eastAsia="Times New Roman" w:cstheme="minorHAnsi"/>
+                <w:sz w:val="20"/>
+                <w:szCs w:val="20"/>
+                <w:lang w:eastAsia="en-IN"/>
+              </w:rPr>
+            </w:pPr>
+            <w:r>
+              <w:rPr>
+                <w:rFonts w:eastAsia="Times New Roman" w:cstheme="minorHAnsi"/>
+                <w:sz w:val="20"/>
+                <w:szCs w:val="20"/>
+                <w:lang w:eastAsia="en-IN"/>
+              </w:rPr>
+              <w:t>*ngFor</w:t>
+            </w:r>
+          </w:p>
+        </w:tc>
+      </w:tr>
+      <w:tr>
+        <w:trPr>
+          <w:tblCellSpacing w:w="15" w:type="dxa"/>
+        </w:trPr>
+        <w:tc>
+          <w:tcPr>
+            <w:tcW w:w="0" w:type="auto"/>
+            <w:vAlign w:val="center"/>
+            <w:hideMark/>
+          </w:tcPr>
+          <w:p>
+            <w:pPr>
+              <w:spacing w:after="0" w:line="240" w:lineRule="auto"/>
+              <w:rPr>
+                <w:rFonts w:eastAsia="Times New Roman" w:cstheme="minorHAnsi"/>
+                <w:sz w:val="20"/>
+                <w:szCs w:val="20"/>
+                <w:lang w:eastAsia="en-IN"/>
+              </w:rPr>
+            </w:pPr>
+            <w:r>
+              <w:rPr>
+                <w:rFonts w:eastAsia="Times New Roman" w:cstheme="minorHAnsi"/>
+                <w:sz w:val="20"/>
+                <w:szCs w:val="20"/>
+                <w:lang w:eastAsia="en-IN"/>
+              </w:rPr>
+              <w:t>@switch</w:t>
+            </w:r>
+          </w:p>
+        </w:tc>
+        <w:tc>
+          <w:tcPr>
+            <w:tcW w:w="0" w:type="auto"/>
+            <w:vAlign w:val="center"/>
+            <w:hideMark/>
+          </w:tcPr>
+          <w:p>
+            <w:pPr>
+              <w:spacing w:after="0" w:line="240" w:lineRule="auto"/>
+              <w:rPr>
+                <w:rFonts w:eastAsia="Times New Roman" w:cstheme="minorHAnsi"/>
+                <w:sz w:val="20"/>
+                <w:szCs w:val="20"/>
+                <w:lang w:eastAsia="en-IN"/>
+              </w:rPr>
+            </w:pPr>
+            <w:r>
+              <w:rPr>
+                <w:rFonts w:eastAsia="Times New Roman" w:cstheme="minorHAnsi"/>
+                <w:sz w:val="20"/>
+                <w:szCs w:val="20"/>
+                <w:lang w:eastAsia="en-IN"/>
+              </w:rPr>
+              <w:t>ngSwitch</w:t>
+            </w:r>
+          </w:p>
+        </w:tc>
+      </w:tr>
+      <w:tr>
+        <w:trPr>
+          <w:tblCellSpacing w:w="15" w:type="dxa"/>
+        </w:trPr>
+        <w:tc>
+          <w:tcPr>
+            <w:tcW w:w="0" w:type="auto"/>
+            <w:vAlign w:val="center"/>
+            <w:hideMark/>
+          </w:tcPr>
+          <w:p>
+            <w:pPr>
+              <w:spacing w:after="0" w:line="240" w:lineRule="auto"/>
+              <w:rPr>
+                <w:rFonts w:eastAsia="Times New Roman" w:cstheme="minorHAnsi"/>
+                <w:sz w:val="20"/>
+                <w:szCs w:val="20"/>
+                <w:lang w:eastAsia="en-IN"/>
+              </w:rPr>
+            </w:pPr>
+            <w:r>
+              <w:rPr>
+                <w:rFonts w:eastAsia="Times New Roman" w:cstheme="minorHAnsi"/>
+                <w:sz w:val="20"/>
+                <w:szCs w:val="20"/>
+                <w:lang w:eastAsia="en-IN"/>
+              </w:rPr>
+              <w:t>@defer</w:t>
+            </w:r>
+          </w:p>
+        </w:tc>
+        <w:tc>
+          <w:tcPr>
+            <w:tcW w:w="0" w:type="auto"/>
+            <w:vAlign w:val="center"/>
+            <w:hideMark/>
+          </w:tcPr>
+          <w:p>
+            <w:pPr>
+              <w:spacing w:after="0" w:line="240" w:lineRule="auto"/>
+              <w:rPr>
+                <w:rFonts w:eastAsia="Times New Roman" w:cstheme="minorHAnsi"/>
+                <w:sz w:val="20"/>
+                <w:szCs w:val="20"/>
+                <w:lang w:eastAsia="en-IN"/>
+              </w:rPr>
+            </w:pPr>
+            <w:r>
+              <w:rPr>
+                <w:rFonts w:eastAsia="Times New Roman" w:cstheme="minorHAnsi"/>
+                <w:sz w:val="20"/>
+                <w:szCs w:val="20"/>
+                <w:lang w:eastAsia="en-IN"/>
+              </w:rPr>
+              <w:t>Lazy rendering</w:t>
+            </w:r>
+          </w:p>
+        </w:tc>
+      </w:tr>
+      <w:tr>
+        <w:trPr>
+          <w:tblCellSpacing w:w="15" w:type="dxa"/>
+        </w:trPr>
+        <w:tc>
+          <w:tcPr>
+            <w:tcW w:w="0" w:type="auto"/>
+            <w:vAlign w:val="center"/>
+            <w:hideMark/>
+          </w:tcPr>
+          <w:p>
+            <w:pPr>
+              <w:spacing w:after="0" w:line="240" w:lineRule="auto"/>
+              <w:rPr>
+                <w:rFonts w:eastAsia="Times New Roman" w:cstheme="minorHAnsi"/>
+                <w:sz w:val="20"/>
+                <w:szCs w:val="20"/>
+                <w:lang w:eastAsia="en-IN"/>
+              </w:rPr>
+            </w:pPr>
+            <w:r>
+              <w:rPr>
+                <w:rFonts w:eastAsia="Times New Roman" w:cstheme="minorHAnsi"/>
+                <w:sz w:val="20"/>
+                <w:szCs w:val="20"/>
+                <w:lang w:eastAsia="en-IN"/>
+              </w:rPr>
+              <w:t>Multiple @case</w:t>
+            </w:r>
+          </w:p>
+        </w:tc>
+        <w:tc>
+          <w:tcPr>
+            <w:tcW w:w="0" w:type="auto"/>
+            <w:vAlign w:val="center"/>
+            <w:hideMark/>
+          </w:tcPr>
+          <w:p>
+            <w:pPr>
+              <w:spacing w:after="0" w:line="240" w:lineRule="auto"/>
+              <w:rPr>
+                <w:rFonts w:eastAsia="Times New Roman" w:cstheme="minorHAnsi"/>
+                <w:sz w:val="20"/>
+                <w:szCs w:val="20"/>
+                <w:lang w:eastAsia="en-IN"/>
+              </w:rPr>
+            </w:pPr>
+            <w:r>
+              <w:rPr>
+                <w:rFonts w:eastAsia="Times New Roman" w:cstheme="minorHAnsi"/>
+                <w:sz w:val="20"/>
+                <w:szCs w:val="20"/>
+                <w:lang w:eastAsia="en-IN"/>
+              </w:rPr>
+              <w:t>Duplicate switch cases</w:t>
+            </w:r>
+          </w:p>
+        </w:tc>
+      </w:tr>
+      <w:tr>
+        <w:trPr>
+          <w:tblCellSpacing w:w="15" w:type="dxa"/>
+        </w:trPr>
+        <w:tc>
+          <w:tcPr>
+            <w:tcW w:w="0" w:type="auto"/>
+            <w:vAlign w:val="center"/>
+            <w:hideMark/>
+          </w:tcPr>
+          <w:p>
+            <w:pPr>
+              <w:spacing w:after="0" w:line="240" w:lineRule="auto"/>
+              <w:rPr>
+                <w:rFonts w:eastAsia="Times New Roman" w:cstheme="minorHAnsi"/>
+                <w:sz w:val="20"/>
+                <w:szCs w:val="20"/>
+                <w:lang w:eastAsia="en-IN"/>
+              </w:rPr>
+            </w:pPr>
+            <w:r>
+              <w:rPr>
+                <w:rFonts w:eastAsia="Times New Roman" w:cstheme="minorHAnsi"/>
+                <w:sz w:val="20"/>
+                <w:szCs w:val="20"/>
+                <w:lang w:eastAsia="en-IN"/>
+              </w:rPr>
+              <w:t>Better class/style bindings</w:t>
+            </w:r>
+          </w:p>
+        </w:tc>
+        <w:tc>
+          <w:tcPr>
+            <w:tcW w:w="0" w:type="auto"/>
+            <w:vAlign w:val="center"/>
+            <w:hideMark/>
+          </w:tcPr>
+          <w:p>
+            <w:pPr>
+              <w:spacing w:after="0" w:line="240" w:lineRule="auto"/>
+              <w:rPr>
+                <w:rFonts w:eastAsia="Times New Roman" w:cstheme="minorHAnsi"/>
+                <w:sz w:val="20"/>
+                <w:szCs w:val="20"/>
+                <w:lang w:eastAsia="en-IN"/>
+              </w:rPr>
+            </w:pPr>
+            <w:r>
+              <w:rPr>
+                <w:rFonts w:eastAsia="Times New Roman" w:cstheme="minorHAnsi"/>
+                <w:sz w:val="20"/>
+                <w:szCs w:val="20"/>
+                <w:lang w:eastAsia="en-IN"/>
+              </w:rPr>
+              <w:t>ngClass/ngStyle</w:t>
+            </w:r>
+          </w:p>
+        </w:tc>
+      </w:tr>
+    </w:tbl>
+    <w:p>
+      <w:pPr>
+        <w:spacing w:after="0" w:line="240" w:lineRule="auto"/>
+        <w:rPr>
+          <w:rFonts w:eastAsia="Times New Roman" w:cstheme="minorHAnsi"/>
+          <w:sz w:val="20"/>
+          <w:szCs w:val="20"/>
+          <w:lang w:eastAsia="en-IN"/>
+        </w:rPr>
+      </w:pPr>
+    </w:p>
+    <w:p>
+      <w:pPr>
+        <w:spacing w:before="100" w:beforeAutospacing="1" w:after="100" w:afterAutospacing="1" w:line="240" w:lineRule="auto"/>
+        <w:outlineLvl w:val="0"/>
+        <w:rPr>
+          <w:rFonts w:eastAsia="Times New Roman" w:cstheme="minorHAnsi"/>
+          <w:b/>
+          <w:bCs/>
+          <w:kern w:val="36"/>
+          <w:sz w:val="20"/>
+          <w:szCs w:val="20"/>
+          <w:lang w:eastAsia="en-IN"/>
+        </w:rPr>
+      </w:pPr>
+      <w:r>
+        <w:rPr>
+          <w:rFonts w:eastAsia="Times New Roman" w:cstheme="minorHAnsi"/>
+          <w:b/>
+          <w:bCs/>
+          <w:kern w:val="36"/>
+          <w:sz w:val="20"/>
+          <w:szCs w:val="20"/>
+          <w:lang w:eastAsia="en-IN"/>
+        </w:rPr>
+        <w:t>Angular 21 Improvement</w:t>
+      </w:r>
+    </w:p>
+    <w:p>
+      <w:pPr>
+        <w:spacing w:before="100" w:beforeAutospacing="1" w:after="100" w:afterAutospacing="1" w:line="240" w:lineRule="auto"/>
+        <w:outlineLvl w:val="1"/>
+        <w:rPr>
+          <w:rFonts w:eastAsia="Times New Roman" w:cstheme="minorHAnsi"/>
+          <w:b/>
+          <w:bCs/>
+          <w:sz w:val="20"/>
+          <w:szCs w:val="20"/>
+          <w:lang w:eastAsia="en-IN"/>
+        </w:rPr>
+      </w:pPr>
+      <w:r>
+        <w:rPr>
+          <w:rFonts w:eastAsia="Times New Roman" w:cstheme="minorHAnsi"/>
+          <w:b/>
+          <w:bCs/>
+          <w:sz w:val="20"/>
+          <w:szCs w:val="20"/>
+          <w:lang w:eastAsia="en-IN"/>
+        </w:rPr>
+        <w:t>Multiple Cases</w:t>
+      </w:r>
+    </w:p>
+    <w:p>
+      <w:pPr>
+        <w:pStyle w:val="code"/>
+      </w:pPr>
+      <w:r>
+        <w:t>@switch(role){</w:t>
+      </w:r>
+      <w:r>
+        <w:br/>
+      </w:r>
+      <w:r>
+        <w:br/>
+        <w:t xml:space="preserve"> @case('admin')</w:t>
+      </w:r>
+      <w:r>
+        <w:br/>
+        <w:t xml:space="preserve"> @case('manager'){</w:t>
+      </w:r>
+      <w:r>
+        <w:br/>
+      </w:r>
+      <w:r>
+        <w:br/>
+        <w:t xml:space="preserve">   &lt;p&gt;Management Access&lt;/p&gt;</w:t>
+      </w:r>
+      <w:r>
+        <w:br/>
+      </w:r>
+      <w:r>
+        <w:br/>
+        <w:t xml:space="preserve"> }</w:t>
+      </w:r>
+      <w:r>
+        <w:br/>
+      </w:r>
+      <w:r>
+        <w:br/>
+        <w:t>}</w:t>
+      </w:r>
+    </w:p>
+    <w:p>
+      <w:pPr>
+        <w:spacing w:after="0" w:line="240" w:lineRule="auto"/>
+        <w:rPr>
+          <w:rFonts w:eastAsia="Times New Roman" w:cstheme="minorHAnsi"/>
+          <w:sz w:val="20"/>
+          <w:szCs w:val="20"/>
+          <w:lang w:eastAsia="en-IN"/>
+        </w:rPr>
+      </w:pPr>
+      <w:r>
+        <w:rPr>
+          <w:rFonts w:eastAsia="Times New Roman" w:cstheme="minorHAnsi"/>
+          <w:sz w:val="20"/>
+          <w:szCs w:val="20"/>
+          <w:lang w:eastAsia="en-IN"/>
+        </w:rPr>
+        <w:pict>
+          <v:rect id="_x0000_i1088" style="width:0;height:1.5pt" o:hralign="center" o:hrstd="t" o:hr="t" fillcolor="#a0a0a0" stroked="f"/>
+        </w:pict>
+      </w:r>
+    </w:p>
+    <w:p>
+      <w:pPr>
+        <w:spacing w:before="100" w:beforeAutospacing="1" w:after="100" w:afterAutospacing="1" w:line="240" w:lineRule="auto"/>
+        <w:outlineLvl w:val="0"/>
+        <w:rPr>
+          <w:rFonts w:eastAsia="Times New Roman" w:cstheme="minorHAnsi"/>
+          <w:b/>
+          <w:bCs/>
+          <w:kern w:val="36"/>
+          <w:sz w:val="20"/>
+          <w:szCs w:val="20"/>
+          <w:lang w:eastAsia="en-IN"/>
+        </w:rPr>
+      </w:pPr>
+      <w:r>
+        <w:rPr>
+          <w:rFonts w:eastAsia="Times New Roman" w:cstheme="minorHAnsi"/>
+          <w:b/>
+          <w:bCs/>
+          <w:kern w:val="36"/>
+          <w:sz w:val="20"/>
+          <w:szCs w:val="20"/>
+          <w:lang w:eastAsia="en-IN"/>
+        </w:rPr>
+        <w:t>Better Class &amp; Style Bindings</w:t>
+      </w:r>
+    </w:p>
+    <w:p>
+      <w:pPr>
+        <w:spacing w:before="100" w:beforeAutospacing="1" w:after="100" w:afterAutospacing="1" w:line="240" w:lineRule="auto"/>
+        <w:rPr>
+          <w:rFonts w:eastAsia="Times New Roman" w:cstheme="minorHAnsi"/>
+          <w:sz w:val="20"/>
+          <w:szCs w:val="20"/>
+          <w:lang w:eastAsia="en-IN"/>
+        </w:rPr>
+      </w:pPr>
+      <w:r>
+        <w:rPr>
+          <w:rFonts w:eastAsia="Times New Roman" w:cstheme="minorHAnsi"/>
+          <w:sz w:val="20"/>
+          <w:szCs w:val="20"/>
+          <w:lang w:eastAsia="en-IN"/>
+        </w:rPr>
+        <w:t>Angular 21 prefers native bindings.</w:t>
+      </w:r>
+    </w:p>
+    <w:p>
+      <w:pPr>
+        <w:spacing w:after="0" w:line="240" w:lineRule="auto"/>
+        <w:rPr>
+          <w:rFonts w:eastAsia="Times New Roman" w:cstheme="minorHAnsi"/>
+          <w:sz w:val="20"/>
+          <w:szCs w:val="20"/>
+          <w:lang w:eastAsia="en-IN"/>
+        </w:rPr>
+      </w:pPr>
+      <w:r>
+        <w:rPr>
+          <w:rFonts w:eastAsia="Times New Roman" w:cstheme="minorHAnsi"/>
+          <w:sz w:val="20"/>
+          <w:szCs w:val="20"/>
+          <w:lang w:eastAsia="en-IN"/>
+        </w:rPr>
+        <w:pict>
+          <v:rect id="_x0000_i1100" style="width:0;height:1.5pt" o:hralign="center" o:hrstd="t" o:hr="t" fillcolor="#a0a0a0" stroked="f"/>
+        </w:pict>
+      </w:r>
+    </w:p>
+    <w:p>
+      <w:pPr>
+        <w:pStyle w:val="code"/>
+      </w:pPr>
+      <w:r>
+        <w:t>Old</w:t>
+      </w:r>
+    </w:p>
+    <w:p>
+      <w:pPr>
+        <w:pStyle w:val="code"/>
+      </w:pPr>
+      <w:r>
+        <w:t>&lt;div [ngClass]="{active:isActive}"&gt;</w:t>
+      </w:r>
+      <w:r>
+        <w:br/>
+        <w:t>&lt;/div&gt;</w:t>
+      </w:r>
+    </w:p>
+    <w:p>
+      <w:pPr>
+        <w:pStyle w:val="code"/>
+      </w:pPr>
+      <w:r>
+        <w:pict>
+          <v:rect id="_x0000_i1101" style="width:0;height:1.5pt" o:hralign="center" o:hrstd="t" o:hr="t" fillcolor="#a0a0a0" stroked="f"/>
+        </w:pict>
+      </w:r>
+    </w:p>
+    <w:p>
+      <w:pPr>
+        <w:pStyle w:val="code"/>
+      </w:pPr>
+      <w:r>
+        <w:t>New</w:t>
+      </w:r>
+    </w:p>
+    <w:p>
+      <w:pPr>
+        <w:pStyle w:val="code"/>
+      </w:pPr>
+      <w:r>
+        <w:t>&lt;div [class.active]="isActive"&gt;</w:t>
+      </w:r>
+      <w:r>
+        <w:br/>
+        <w:t>&lt;/div&gt;</w:t>
+      </w:r>
+    </w:p>
+    <w:p>
+      <w:pPr>
+        <w:pStyle w:val="code"/>
+      </w:pPr>
+      <w:r>
+        <w:lastRenderedPageBreak/>
+        <w:pict>
+          <v:rect id="_x0000_i1102" style="width:0;height:1.5pt" o:hralign="center" o:hrstd="t" o:hr="t" fillcolor="#a0a0a0" stroked="f"/>
+        </w:pict>
+      </w:r>
+    </w:p>
+    <w:p>
+      <w:pPr>
+        <w:pStyle w:val="code"/>
+      </w:pPr>
+      <w:r>
+        <w:t>Old</w:t>
+      </w:r>
+    </w:p>
+    <w:p>
+      <w:pPr>
+        <w:pStyle w:val="code"/>
+      </w:pPr>
+      <w:r>
+        <w:t>&lt;div [ngStyle]="{color:'red'}"&gt;</w:t>
+      </w:r>
+      <w:r>
+        <w:br/>
+        <w:t>&lt;/div&gt;</w:t>
+      </w:r>
+    </w:p>
+    <w:p>
+      <w:pPr>
+        <w:pStyle w:val="code"/>
+      </w:pPr>
+      <w:r>
+        <w:pict>
+          <v:rect id="_x0000_i1103" style="width:0;height:1.5pt" o:hralign="center" o:hrstd="t" o:hr="t" fillcolor="#a0a0a0" stroked="f"/>
+        </w:pict>
+      </w:r>
+    </w:p>
+    <w:p>
+      <w:pPr>
+        <w:pStyle w:val="code"/>
+      </w:pPr>
+      <w:r>
+        <w:t>New</w:t>
+      </w:r>
+    </w:p>
+    <w:p>
+      <w:pPr>
+        <w:pStyle w:val="code"/>
+      </w:pPr>
+      <w:r>
+        <w:t>&lt;div [style.color]="'red'"&gt;</w:t>
+      </w:r>
+      <w:r>
+        <w:br/>
+        <w:t>&lt;/div&gt;</w:t>
+      </w:r>
+    </w:p>
+    <w:p>
+      <w:pPr>
+        <w:spacing w:after="0" w:line="240" w:lineRule="auto"/>
+        <w:rPr>
+          <w:rFonts w:eastAsia="Times New Roman" w:cstheme="minorHAnsi"/>
+          <w:sz w:val="20"/>
+          <w:szCs w:val="20"/>
+          <w:lang w:eastAsia="en-IN"/>
+        </w:rPr>
+      </w:pPr>
+      <w:r>
+        <w:rPr>
+          <w:rFonts w:eastAsia="Times New Roman" w:cstheme="minorHAnsi"/>
+          <w:sz w:val="20"/>
+          <w:szCs w:val="20"/>
+          <w:lang w:eastAsia="en-IN"/>
+        </w:rPr>
+        <w:pict>
+          <v:rect id="_x0000_i1104" style="width:0;height:1.5pt" o:hralign="center" o:hrstd="t" o:hr="t" fillcolor="#a0a0a0" stroked="f"/>
+        </w:pict>
+      </w:r>
+    </w:p>
+    <w:p>
+      <w:pPr>
+        <w:spacing w:before="100" w:beforeAutospacing="1" w:after="100" w:afterAutospacing="1" w:line="240" w:lineRule="auto"/>
+        <w:outlineLvl w:val="0"/>
+        <w:rPr>
+          <w:rFonts w:eastAsia="Times New Roman" w:cstheme="minorHAnsi"/>
+          <w:b/>
+          <w:bCs/>
+          <w:kern w:val="36"/>
+          <w:sz w:val="20"/>
+          <w:szCs w:val="20"/>
+          <w:lang w:eastAsia="en-IN"/>
+        </w:rPr>
+      </w:pPr>
+      <w:r>
+        <w:rPr>
+          <w:rFonts w:eastAsia="Times New Roman" w:cstheme="minorHAnsi"/>
+          <w:b/>
+          <w:bCs/>
+          <w:kern w:val="36"/>
+          <w:sz w:val="20"/>
+          <w:szCs w:val="20"/>
+          <w:lang w:eastAsia="en-IN"/>
+        </w:rPr>
+        <w:t>Why Better?</w:t>
+      </w:r>
+    </w:p>
+    <w:p>
+      <w:pPr>
+        <w:spacing w:before="100" w:beforeAutospacing="1" w:after="100" w:afterAutospacing="1" w:line="240" w:lineRule="auto"/>
+        <w:rPr>
+          <w:rFonts w:eastAsia="Times New Roman" w:cstheme="minorHAnsi"/>
+          <w:sz w:val="20"/>
+          <w:szCs w:val="20"/>
+          <w:lang w:eastAsia="en-IN"/>
+        </w:rPr>
+      </w:pPr>
+      <w:r>
+        <w:rPr>
+          <w:rFonts w:ascii="Segoe UI Symbol" w:eastAsia="Times New Roman" w:hAnsi="Segoe UI Symbol" w:cs="Segoe UI Symbol"/>
+          <w:sz w:val="20"/>
+          <w:szCs w:val="20"/>
+          <w:lang w:eastAsia="en-IN"/>
+        </w:rPr>
+        <w:t>✅</w:t>
+      </w:r>
+      <w:r>
+        <w:rPr>
+          <w:rFonts w:eastAsia="Times New Roman" w:cstheme="minorHAnsi"/>
+          <w:sz w:val="20"/>
+          <w:szCs w:val="20"/>
+          <w:lang w:eastAsia="en-IN"/>
+        </w:rPr>
+        <w:t xml:space="preserve"> Faster</w:t>
+      </w:r>
+      <w:r>
+        <w:rPr>
+          <w:rFonts w:eastAsia="Times New Roman" w:cstheme="minorHAnsi"/>
+          <w:sz w:val="20"/>
+          <w:szCs w:val="20"/>
+          <w:lang w:eastAsia="en-IN"/>
+        </w:rPr>
+        <w:br/>
+      </w:r>
+      <w:r>
+        <w:rPr>
+          <w:rFonts w:ascii="Segoe UI Symbol" w:eastAsia="Times New Roman" w:hAnsi="Segoe UI Symbol" w:cs="Segoe UI Symbol"/>
+          <w:sz w:val="20"/>
+          <w:szCs w:val="20"/>
+          <w:lang w:eastAsia="en-IN"/>
+        </w:rPr>
+        <w:t>✅</w:t>
+      </w:r>
+      <w:r>
+        <w:rPr>
+          <w:rFonts w:eastAsia="Times New Roman" w:cstheme="minorHAnsi"/>
+          <w:sz w:val="20"/>
+          <w:szCs w:val="20"/>
+          <w:lang w:eastAsia="en-IN"/>
+        </w:rPr>
+        <w:t xml:space="preserve"> Less directive overhead</w:t>
+      </w:r>
+      <w:r>
+        <w:rPr>
+          <w:rFonts w:eastAsia="Times New Roman" w:cstheme="minorHAnsi"/>
+          <w:sz w:val="20"/>
+          <w:szCs w:val="20"/>
+          <w:lang w:eastAsia="en-IN"/>
+        </w:rPr>
+        <w:br/>
+      </w:r>
+      <w:r>
+        <w:rPr>
+          <w:rFonts w:ascii="Segoe UI Symbol" w:eastAsia="Times New Roman" w:hAnsi="Segoe UI Symbol" w:cs="Segoe UI Symbol"/>
+          <w:sz w:val="20"/>
+          <w:szCs w:val="20"/>
+          <w:lang w:eastAsia="en-IN"/>
+        </w:rPr>
+        <w:t>✅</w:t>
+      </w:r>
+      <w:r>
+        <w:rPr>
+          <w:rFonts w:eastAsia="Times New Roman" w:cstheme="minorHAnsi"/>
+          <w:sz w:val="20"/>
+          <w:szCs w:val="20"/>
+          <w:lang w:eastAsia="en-IN"/>
+        </w:rPr>
+        <w:t xml:space="preserve"> Better compiler optimization</w:t>
+      </w:r>
+    </w:p>
+    <w:p>
+      <w:pPr>
+        <w:spacing w:after="0" w:line="240" w:lineRule="auto"/>
+        <w:rPr>
+          <w:rFonts w:eastAsia="Times New Roman" w:cstheme="minorHAnsi"/>
+          <w:sz w:val="20"/>
+          <w:szCs w:val="20"/>
+          <w:lang w:eastAsia="en-IN"/>
+        </w:rPr>
+      </w:pPr>
+      <w:r>
+        <w:rPr>
+          <w:rFonts w:eastAsia="Times New Roman" w:cstheme="minorHAnsi"/>
+          <w:sz w:val="20"/>
+          <w:szCs w:val="20"/>
+          <w:lang w:eastAsia="en-IN"/>
+        </w:rPr>
+        <w:pict>
+          <v:rect id="_x0000_i1105" style="width:0;height:1.5pt" o:hralign="center" o:hrstd="t" o:hr="t" fillcolor="#a0a0a0" stroked="f"/>
+        </w:pict>
+      </w:r>
+    </w:p>
+    <w:p>
+      <w:pPr>
+        <w:spacing w:before="100" w:beforeAutospacing="1" w:after="100" w:afterAutospacing="1" w:line="240" w:lineRule="auto"/>
+        <w:outlineLvl w:val="0"/>
+        <w:rPr>
+          <w:rFonts w:eastAsia="Times New Roman" w:cstheme="minorHAnsi"/>
+          <w:b/>
+          <w:bCs/>
+          <w:kern w:val="36"/>
+          <w:sz w:val="20"/>
+          <w:szCs w:val="20"/>
+          <w:lang w:eastAsia="en-IN"/>
+        </w:rPr>
+      </w:pPr>
+      <w:r>
+        <w:rPr>
+          <w:rFonts w:eastAsia="Times New Roman" w:cstheme="minorHAnsi"/>
+          <w:b/>
+          <w:bCs/>
+          <w:kern w:val="36"/>
+          <w:sz w:val="20"/>
+          <w:szCs w:val="20"/>
+          <w:lang w:eastAsia="en-IN"/>
+        </w:rPr>
+        <w:t>Cleaner Templates</w:t>
+      </w:r>
+    </w:p>
+    <w:p>
+      <w:pPr>
+        <w:spacing w:before="100" w:beforeAutospacing="1" w:after="100" w:afterAutospacing="1" w:line="240" w:lineRule="auto"/>
+        <w:rPr>
+          <w:rFonts w:eastAsia="Times New Roman" w:cstheme="minorHAnsi"/>
+          <w:sz w:val="20"/>
+          <w:szCs w:val="20"/>
+          <w:lang w:eastAsia="en-IN"/>
+        </w:rPr>
+      </w:pPr>
+      <w:r>
+        <w:rPr>
+          <w:rFonts w:eastAsia="Times New Roman" w:cstheme="minorHAnsi"/>
+          <w:sz w:val="20"/>
+          <w:szCs w:val="20"/>
+          <w:lang w:eastAsia="en-IN"/>
+        </w:rPr>
+        <w:t>Angular enhanced syntax removes:</w:t>
+      </w:r>
+    </w:p>
+    <w:p>
+      <w:pPr>
+        <w:spacing w:before="100" w:beforeAutospacing="1" w:after="100" w:afterAutospacing="1" w:line="240" w:lineRule="auto"/>
+        <w:rPr>
+          <w:rFonts w:eastAsia="Times New Roman" w:cstheme="minorHAnsi"/>
+          <w:sz w:val="20"/>
+          <w:szCs w:val="20"/>
+          <w:lang w:eastAsia="en-IN"/>
+        </w:rPr>
+      </w:pPr>
+      <w:r>
+        <w:rPr>
+          <w:rFonts w:ascii="Segoe UI Symbol" w:eastAsia="Times New Roman" w:hAnsi="Segoe UI Symbol" w:cs="Segoe UI Symbol"/>
+          <w:sz w:val="20"/>
+          <w:szCs w:val="20"/>
+          <w:lang w:eastAsia="en-IN"/>
+        </w:rPr>
+        <w:t>❌</w:t>
+      </w:r>
+      <w:r>
+        <w:rPr>
+          <w:rFonts w:eastAsia="Times New Roman" w:cstheme="minorHAnsi"/>
+          <w:sz w:val="20"/>
+          <w:szCs w:val="20"/>
+          <w:lang w:eastAsia="en-IN"/>
+        </w:rPr>
+        <w:t xml:space="preserve"> excessive &lt;ng-template&gt;</w:t>
+      </w:r>
+      <w:r>
+        <w:rPr>
+          <w:rFonts w:eastAsia="Times New Roman" w:cstheme="minorHAnsi"/>
+          <w:sz w:val="20"/>
+          <w:szCs w:val="20"/>
+          <w:lang w:eastAsia="en-IN"/>
+        </w:rPr>
+        <w:br/>
+      </w:r>
+      <w:r>
+        <w:rPr>
+          <w:rFonts w:ascii="Segoe UI Symbol" w:eastAsia="Times New Roman" w:hAnsi="Segoe UI Symbol" w:cs="Segoe UI Symbol"/>
+          <w:sz w:val="20"/>
+          <w:szCs w:val="20"/>
+          <w:lang w:eastAsia="en-IN"/>
+        </w:rPr>
+        <w:t>❌</w:t>
+      </w:r>
+      <w:r>
+        <w:rPr>
+          <w:rFonts w:eastAsia="Times New Roman" w:cstheme="minorHAnsi"/>
+          <w:sz w:val="20"/>
+          <w:szCs w:val="20"/>
+          <w:lang w:eastAsia="en-IN"/>
+        </w:rPr>
+        <w:t xml:space="preserve"> microsyntax complexity</w:t>
+      </w:r>
+      <w:r>
+        <w:rPr>
+          <w:rFonts w:eastAsia="Times New Roman" w:cstheme="minorHAnsi"/>
+          <w:sz w:val="20"/>
+          <w:szCs w:val="20"/>
+          <w:lang w:eastAsia="en-IN"/>
+        </w:rPr>
+        <w:br/>
+      </w:r>
+      <w:r>
+        <w:rPr>
+          <w:rFonts w:ascii="Segoe UI Symbol" w:eastAsia="Times New Roman" w:hAnsi="Segoe UI Symbol" w:cs="Segoe UI Symbol"/>
+          <w:sz w:val="20"/>
+          <w:szCs w:val="20"/>
+          <w:lang w:eastAsia="en-IN"/>
+        </w:rPr>
+        <w:t>❌</w:t>
+      </w:r>
+      <w:r>
+        <w:rPr>
+          <w:rFonts w:eastAsia="Times New Roman" w:cstheme="minorHAnsi"/>
+          <w:sz w:val="20"/>
+          <w:szCs w:val="20"/>
+          <w:lang w:eastAsia="en-IN"/>
+        </w:rPr>
+        <w:t xml:space="preserve"> nested directives</w:t>
+      </w:r>
+    </w:p>
+    <w:p>
+      <w:pPr>
+        <w:pStyle w:val="Heading1"/>
+        <w:rPr>
+          <w:rFonts w:asciiTheme="minorHAnsi" w:hAnsiTheme="minorHAnsi" w:cstheme="minorHAnsi"/>
+          <w:sz w:val="20"/>
+          <w:szCs w:val="20"/>
+        </w:rPr>
+      </w:pPr>
+      <w:r>
+        <w:rPr>
+          <w:rFonts w:asciiTheme="minorHAnsi" w:hAnsiTheme="minorHAnsi" w:cstheme="minorHAnsi"/>
+          <w:sz w:val="20"/>
+          <w:szCs w:val="20"/>
+        </w:rPr>
+        <w:t>Before</w:t>
+      </w:r>
+    </w:p>
+    <w:p>
+      <w:pPr>
+        <w:pStyle w:val="code"/>
+      </w:pPr>
+      <w:r>
+        <w:rPr>
+          <w:rStyle w:val="o"/>
+        </w:rPr>
+        <w:t>&lt;ng-container</w:t>
+      </w:r>
+      <w:r>
+        <w:rPr>
+          <w:rStyle w:val="HTMLCode"/>
+        </w:rPr>
+        <w:t xml:space="preserve"> </w:t>
+      </w:r>
+      <w:r>
+        <w:rPr>
+          <w:rStyle w:val="n"/>
+        </w:rPr>
+        <w:t>*ngIf</w:t>
+      </w:r>
+      <w:r>
+        <w:rPr>
+          <w:rStyle w:val="g"/>
+        </w:rPr>
+        <w:t>=</w:t>
+      </w:r>
+      <w:r>
+        <w:rPr>
+          <w:rStyle w:val="k"/>
+        </w:rPr>
+        <w:t>"users.length"</w:t>
+      </w:r>
+      <w:r>
+        <w:rPr>
+          <w:rStyle w:val="o"/>
+        </w:rPr>
+        <w:t>&gt;</w:t>
+      </w:r>
+      <w:r>
+        <w:br/>
+      </w:r>
+      <w:r>
+        <w:br/>
+      </w:r>
+      <w:r>
+        <w:rPr>
+          <w:rStyle w:val="HTMLCode"/>
+        </w:rPr>
+        <w:t xml:space="preserve"> </w:t>
+      </w:r>
+      <w:r>
+        <w:rPr>
+          <w:rStyle w:val="o"/>
+        </w:rPr>
+        <w:t>&lt;div</w:t>
+      </w:r>
+      <w:r>
+        <w:rPr>
+          <w:rStyle w:val="HTMLCode"/>
+        </w:rPr>
+        <w:t xml:space="preserve"> </w:t>
+      </w:r>
+      <w:r>
+        <w:rPr>
+          <w:rStyle w:val="n"/>
+        </w:rPr>
+        <w:t>*ngFor</w:t>
+      </w:r>
+      <w:r>
+        <w:rPr>
+          <w:rStyle w:val="g"/>
+        </w:rPr>
+        <w:t>=</w:t>
+      </w:r>
+      <w:r>
+        <w:rPr>
+          <w:rStyle w:val="k"/>
+        </w:rPr>
+        <w:t>"let user of users"</w:t>
+      </w:r>
+      <w:r>
+        <w:rPr>
+          <w:rStyle w:val="o"/>
+        </w:rPr>
+        <w:t>&gt;</w:t>
+      </w:r>
+      <w:r>
+        <w:br/>
+      </w:r>
+      <w:r>
+        <w:br/>
+      </w:r>
+      <w:r>
+        <w:rPr>
+          <w:rStyle w:val="HTMLCode"/>
+        </w:rPr>
+        <w:t xml:space="preserve">   {{user.name}}</w:t>
+      </w:r>
+      <w:r>
+        <w:br/>
+      </w:r>
+      <w:r>
+        <w:br/>
+      </w:r>
+      <w:r>
+        <w:rPr>
+          <w:rStyle w:val="HTMLCode"/>
+        </w:rPr>
+        <w:t xml:space="preserve"> </w:t>
+      </w:r>
+      <w:r>
+        <w:rPr>
+          <w:rStyle w:val="o"/>
+        </w:rPr>
+        <w:t>&lt;/div&gt;</w:t>
+      </w:r>
+      <w:r>
+        <w:br/>
+      </w:r>
+      <w:r>
+        <w:br/>
+      </w:r>
+      <w:r>
+        <w:rPr>
+          <w:rStyle w:val="o"/>
+        </w:rPr>
+        <w:t>&lt;/ng-container&gt;</w:t>
+      </w:r>
+    </w:p>
+    <w:p>
+      <w:pPr>
+        <w:rPr>
+          <w:rFonts w:cstheme="minorHAnsi"/>
+          <w:sz w:val="20"/>
+          <w:szCs w:val="20"/>
+        </w:rPr>
+      </w:pPr>
+      <w:r>
+        <w:rPr>
+          <w:rFonts w:cstheme="minorHAnsi"/>
+          <w:sz w:val="20"/>
+          <w:szCs w:val="20"/>
+        </w:rPr>
+        <w:pict>
+          <v:rect id="_x0000_i1235" style="width:0;height:1.5pt" o:hralign="center" o:hrstd="t" o:hr="t" fillcolor="#a0a0a0" stroked="f"/>
+        </w:pict>
+      </w:r>
+    </w:p>
+    <w:p>
+      <w:pPr>
+        <w:pStyle w:val="Heading1"/>
+        <w:rPr>
+          <w:rFonts w:asciiTheme="minorHAnsi" w:hAnsiTheme="minorHAnsi" w:cstheme="minorHAnsi"/>
+          <w:sz w:val="20"/>
+          <w:szCs w:val="20"/>
+        </w:rPr>
+      </w:pPr>
+      <w:r>
+        <w:rPr>
+          <w:rFonts w:asciiTheme="minorHAnsi" w:hAnsiTheme="minorHAnsi" w:cstheme="minorHAnsi"/>
+          <w:sz w:val="20"/>
+          <w:szCs w:val="20"/>
+        </w:rPr>
+        <w:t>Modern Angular</w:t>
+      </w:r>
+    </w:p>
+    <w:p>
+      <w:pPr>
+        <w:pStyle w:val="code"/>
+        <w:rPr>
+          <w:rStyle w:val="HTMLCode"/>
+        </w:rPr>
+      </w:pPr>
+      <w:r>
+        <w:rPr>
+          <w:rStyle w:val="HTMLCode"/>
+        </w:rPr>
+        <w:t>@if(users.length){</w:t>
+      </w:r>
+      <w:r>
+        <w:br/>
+      </w:r>
+      <w:r>
+        <w:br/>
+      </w:r>
+      <w:r>
+        <w:rPr>
+          <w:rStyle w:val="HTMLCode"/>
+        </w:rPr>
+        <w:t xml:space="preserve"> @for(user of users; track user.id){</w:t>
+      </w:r>
+      <w:r>
+        <w:br/>
+      </w:r>
+      <w:r>
+        <w:br/>
+      </w:r>
+      <w:r>
+        <w:rPr>
+          <w:rStyle w:val="HTMLCode"/>
+        </w:rPr>
+        <w:t xml:space="preserve">   </w:t>
+      </w:r>
+      <w:r>
+        <w:rPr>
+          <w:rStyle w:val="o"/>
+        </w:rPr>
+        <w:t>&lt;div&gt;</w:t>
+      </w:r>
+      <w:r>
+        <w:rPr>
+          <w:rStyle w:val="HTMLCode"/>
+        </w:rPr>
+        <w:t>{{user.name}}</w:t>
+      </w:r>
+      <w:r>
+        <w:rPr>
+          <w:rStyle w:val="o"/>
+        </w:rPr>
+        <w:t>&lt;/div&gt;</w:t>
+      </w:r>
+      <w:r>
+        <w:br/>
+      </w:r>
+      <w:r>
+        <w:br/>
+      </w:r>
+      <w:r>
+        <w:rPr>
+          <w:rStyle w:val="HTMLCode"/>
+        </w:rPr>
+        <w:t xml:space="preserve"> }</w:t>
+      </w:r>
+      <w:r>
+        <w:br/>
+      </w:r>
+      <w:r>
+        <w:br/>
+      </w:r>
+      <w:r>
+        <w:rPr>
+          <w:rStyle w:val="HTMLCode"/>
+        </w:rPr>
+        <w:t>}</w:t>
+      </w:r>
+    </w:p>
+    <w:p>
+      <w:pPr>
+        <w:pStyle w:val="Heading2"/>
+        <w:rPr>
+          <w:rFonts w:asciiTheme="minorHAnsi" w:hAnsiTheme="minorHAnsi" w:cstheme="minorHAnsi"/>
+          <w:sz w:val="20"/>
+          <w:szCs w:val="20"/>
+        </w:rPr>
+      </w:pPr>
+      <w:r>
+        <w:rPr>
+          <w:rFonts w:asciiTheme="minorHAnsi" w:hAnsiTheme="minorHAnsi" w:cstheme="minorHAnsi"/>
+          <w:sz w:val="20"/>
+          <w:szCs w:val="20"/>
+        </w:rPr>
+        <w:t>What is Enhanced Template Syntax in Angular?</w:t>
+      </w:r>
+      <w:bookmarkStart w:id="0" w:name="_GoBack"/>
+      <w:bookmarkEnd w:id="0"/>
+    </w:p>
+    <w:p>
+      <w:pPr>
+        <w:pStyle w:val="NormalWeb"/>
+        <w:rPr>
+          <w:rFonts w:asciiTheme="minorHAnsi" w:hAnsiTheme="minorHAnsi" w:cstheme="minorHAnsi"/>
+          <w:sz w:val="20"/>
+          <w:szCs w:val="20"/>
+        </w:rPr>
+      </w:pPr>
+      <w:r>
+        <w:rPr>
+          <w:rFonts w:asciiTheme="minorHAnsi" w:hAnsiTheme="minorHAnsi" w:cstheme="minorHAnsi"/>
+          <w:sz w:val="20"/>
+          <w:szCs w:val="20"/>
+        </w:rPr>
+        <w:t xml:space="preserve">Enhanced Template Syntax is Angular’s modern block-based template system using </w:t>
+      </w:r>
+      <w:r>
+        <w:rPr>
+          <w:rStyle w:val="HTMLCode"/>
+          <w:rFonts w:asciiTheme="minorHAnsi" w:hAnsiTheme="minorHAnsi" w:cstheme="minorHAnsi"/>
+        </w:rPr>
+        <w:t>@if</w:t>
+      </w:r>
+      <w:r>
+        <w:rPr>
+          <w:rFonts w:asciiTheme="minorHAnsi" w:hAnsiTheme="minorHAnsi" w:cstheme="minorHAnsi"/>
+          <w:sz w:val="20"/>
+          <w:szCs w:val="20"/>
+        </w:rPr>
+        <w:t xml:space="preserve">, </w:t>
+      </w:r>
+      <w:r>
+        <w:rPr>
+          <w:rStyle w:val="HTMLCode"/>
+          <w:rFonts w:asciiTheme="minorHAnsi" w:hAnsiTheme="minorHAnsi" w:cstheme="minorHAnsi"/>
+        </w:rPr>
+        <w:t>@for</w:t>
+      </w:r>
+      <w:r>
+        <w:rPr>
+          <w:rFonts w:asciiTheme="minorHAnsi" w:hAnsiTheme="minorHAnsi" w:cstheme="minorHAnsi"/>
+          <w:sz w:val="20"/>
+          <w:szCs w:val="20"/>
+        </w:rPr>
+        <w:t xml:space="preserve">, </w:t>
+      </w:r>
+      <w:r>
+        <w:rPr>
+          <w:rStyle w:val="HTMLCode"/>
+          <w:rFonts w:asciiTheme="minorHAnsi" w:hAnsiTheme="minorHAnsi" w:cstheme="minorHAnsi"/>
+        </w:rPr>
+        <w:t>@switch</w:t>
+      </w:r>
+      <w:r>
+        <w:rPr>
+          <w:rFonts w:asciiTheme="minorHAnsi" w:hAnsiTheme="minorHAnsi" w:cstheme="minorHAnsi"/>
+          <w:sz w:val="20"/>
+          <w:szCs w:val="20"/>
+        </w:rPr>
+        <w:t xml:space="preserve">, and </w:t>
+      </w:r>
+      <w:r>
+        <w:rPr>
+          <w:rStyle w:val="HTMLCode"/>
+          <w:rFonts w:asciiTheme="minorHAnsi" w:hAnsiTheme="minorHAnsi" w:cstheme="minorHAnsi"/>
+        </w:rPr>
+        <w:t>@defer</w:t>
+      </w:r>
+      <w:r>
+        <w:rPr>
+          <w:rFonts w:asciiTheme="minorHAnsi" w:hAnsiTheme="minorHAnsi" w:cstheme="minorHAnsi"/>
+          <w:sz w:val="20"/>
+          <w:szCs w:val="20"/>
+        </w:rPr>
+        <w:t xml:space="preserve"> to improve readability, performance, and developer experience compared to older structural directives like </w:t>
+      </w:r>
+      <w:r>
+        <w:rPr>
+          <w:rStyle w:val="HTMLCode"/>
+          <w:rFonts w:asciiTheme="minorHAnsi" w:hAnsiTheme="minorHAnsi" w:cstheme="minorHAnsi"/>
+        </w:rPr>
+        <w:t>*ngIf</w:t>
+      </w:r>
+      <w:r>
+        <w:rPr>
+          <w:rFonts w:asciiTheme="minorHAnsi" w:hAnsiTheme="minorHAnsi" w:cstheme="minorHAnsi"/>
+          <w:sz w:val="20"/>
+          <w:szCs w:val="20"/>
+        </w:rPr>
+        <w:t xml:space="preserve"> and </w:t>
+      </w:r>
+      <w:r>
+        <w:rPr>
+          <w:rStyle w:val="HTMLCode"/>
+          <w:rFonts w:asciiTheme="minorHAnsi" w:hAnsiTheme="minorHAnsi" w:cstheme="minorHAnsi"/>
+        </w:rPr>
+        <w:t>*ngFor</w:t>
+      </w:r>
+      <w:r>
+        <w:rPr>
+          <w:rFonts w:asciiTheme="minorHAnsi" w:hAnsiTheme="minorHAnsi" w:cstheme="minorHAnsi"/>
+          <w:sz w:val="20"/>
+          <w:szCs w:val="20"/>
+        </w:rPr>
+        <w:t>.</w:t>
+      </w:r>
+    </w:p>
+    <w:p>
+      <w:pPr>
+        <w:pStyle w:val="code"/>
+      </w:pPr>
+    </w:p>
+    <w:p>
+      <w:pPr>
+        <w:spacing w:before="100" w:beforeAutospacing="1" w:after="100" w:afterAutospacing="1" w:line="240" w:lineRule="auto"/>
+        <w:rPr>
+          <w:rFonts w:eastAsia="Times New Roman" w:cstheme="minorHAnsi"/>
+          <w:sz w:val="20"/>
+          <w:szCs w:val="20"/>
+          <w:lang w:eastAsia="en-IN"/>
+        </w:rPr>
+      </w:pPr>
+    </w:p>
+    <w:p>
+      <w:pPr>
         <w:rPr>
           <w:rFonts w:cstheme="minorHAnsi"/>
           <w:b/>
@@ -11965,6 +13423,155 @@
     <w:nsid w:val="6AFF0814"/>
     <w:multiLevelType w:val="multilevel"/>
     <w:tmpl w:val="15164524"/>
+    <w:lvl w:ilvl="0">
+      <w:start w:val="1"/>
+      <w:numFmt w:val="bullet"/>
+      <w:lvlText w:val=""/>
+      <w:lvlJc w:val="left"/>
+      <w:pPr>
+        <w:tabs>
+          <w:tab w:val="num" w:pos="720"/>
+        </w:tabs>
+        <w:ind w:left="720" w:hanging="360"/>
+      </w:pPr>
+      <w:rPr>
+        <w:rFonts w:ascii="Symbol" w:hAnsi="Symbol" w:hint="default"/>
+        <w:sz w:val="20"/>
+      </w:rPr>
+    </w:lvl>
+    <w:lvl w:ilvl="1" w:tentative="1">
+      <w:start w:val="1"/>
+      <w:numFmt w:val="bullet"/>
+      <w:lvlText w:val="o"/>
+      <w:lvlJc w:val="left"/>
+      <w:pPr>
+        <w:tabs>
+          <w:tab w:val="num" w:pos="1440"/>
+        </w:tabs>
+        <w:ind w:left="1440" w:hanging="360"/>
+      </w:pPr>
+      <w:rPr>
+        <w:rFonts w:ascii="Courier New" w:hAnsi="Courier New" w:hint="default"/>
+        <w:sz w:val="20"/>
+      </w:rPr>
+    </w:lvl>
+    <w:lvl w:ilvl="2" w:tentative="1">
+      <w:start w:val="1"/>
+      <w:numFmt w:val="bullet"/>
+      <w:lvlText w:val=""/>
+      <w:lvlJc w:val="left"/>
+      <w:pPr>
+        <w:tabs>
+          <w:tab w:val="num" w:pos="2160"/>
+        </w:tabs>
+        <w:ind w:left="2160" w:hanging="360"/>
+      </w:pPr>
+      <w:rPr>
+        <w:rFonts w:ascii="Wingdings" w:hAnsi="Wingdings" w:hint="default"/>
+        <w:sz w:val="20"/>
+      </w:rPr>
+    </w:lvl>
+    <w:lvl w:ilvl="3" w:tentative="1">
+      <w:start w:val="1"/>
+      <w:numFmt w:val="bullet"/>
+      <w:lvlText w:val=""/>
+      <w:lvlJc w:val="left"/>
+      <w:pPr>
+        <w:tabs>
+          <w:tab w:val="num" w:pos="2880"/>
+        </w:tabs>
+        <w:ind w:left="2880" w:hanging="360"/>
+      </w:pPr>
+      <w:rPr>
+        <w:rFonts w:ascii="Wingdings" w:hAnsi="Wingdings" w:hint="default"/>
+        <w:sz w:val="20"/>
+      </w:rPr>
+    </w:lvl>
+    <w:lvl w:ilvl="4" w:tentative="1">
+      <w:start w:val="1"/>
+      <w:numFmt w:val="bullet"/>
+      <w:lvlText w:val=""/>
+      <w:lvlJc w:val="left"/>
+      <w:pPr>
+        <w:tabs>
+          <w:tab w:val="num" w:pos="3600"/>
+        </w:tabs>
+        <w:ind w:left="3600" w:hanging="360"/>
+      </w:pPr>
+      <w:rPr>
+        <w:rFonts w:ascii="Wingdings" w:hAnsi="Wingdings" w:hint="default"/>
+        <w:sz w:val="20"/>
+      </w:rPr>
+    </w:lvl>
+    <w:lvl w:ilvl="5" w:tentative="1">
+      <w:start w:val="1"/>
+      <w:numFmt w:val="bullet"/>
+      <w:lvlText w:val=""/>
+      <w:lvlJc w:val="left"/>
+      <w:pPr>
+        <w:tabs>
+          <w:tab w:val="num" w:pos="4320"/>
+        </w:tabs>
+        <w:ind w:left="4320" w:hanging="360"/>
+      </w:pPr>
+      <w:rPr>
+        <w:rFonts w:ascii="Wingdings" w:hAnsi="Wingdings" w:hint="default"/>
+        <w:sz w:val="20"/>
+      </w:rPr>
+    </w:lvl>
+    <w:lvl w:ilvl="6" w:tentative="1">
+      <w:start w:val="1"/>
+      <w:numFmt w:val="bullet"/>
+      <w:lvlText w:val=""/>
+      <w:lvlJc w:val="left"/>
+      <w:pPr>
+        <w:tabs>
+          <w:tab w:val="num" w:pos="5040"/>
+        </w:tabs>
+        <w:ind w:left="5040" w:hanging="360"/>
+      </w:pPr>
+      <w:rPr>
+        <w:rFonts w:ascii="Wingdings" w:hAnsi="Wingdings" w:hint="default"/>
+        <w:sz w:val="20"/>
+      </w:rPr>
+    </w:lvl>
+    <w:lvl w:ilvl="7" w:tentative="1">
+      <w:start w:val="1"/>
+      <w:numFmt w:val="bullet"/>
+      <w:lvlText w:val=""/>
+      <w:lvlJc w:val="left"/>
+      <w:pPr>
+        <w:tabs>
+          <w:tab w:val="num" w:pos="5760"/>
+        </w:tabs>
+        <w:ind w:left="5760" w:hanging="360"/>
+      </w:pPr>
+      <w:rPr>
+        <w:rFonts w:ascii="Wingdings" w:hAnsi="Wingdings" w:hint="default"/>
+        <w:sz w:val="20"/>
+      </w:rPr>
+    </w:lvl>
+    <w:lvl w:ilvl="8" w:tentative="1">
+      <w:start w:val="1"/>
+      <w:numFmt w:val="bullet"/>
+      <w:lvlText w:val=""/>
+      <w:lvlJc w:val="left"/>
+      <w:pPr>
+        <w:tabs>
+          <w:tab w:val="num" w:pos="6480"/>
+        </w:tabs>
+        <w:ind w:left="6480" w:hanging="360"/>
+      </w:pPr>
+      <w:rPr>
+        <w:rFonts w:ascii="Wingdings" w:hAnsi="Wingdings" w:hint="default"/>
+        <w:sz w:val="20"/>
+      </w:rPr>
+    </w:lvl>
+  </w:abstractNum>
+  <w:abstractNum w:abstractNumId="12" w15:restartNumberingAfterBreak="0">
+    <w:nsid w:val="6EEF2539"/>
+    <w:multiLevelType w:val="multilevel"/>
+    <w:tmpl w:val="4EB4BD96"/>
     <w:lvl w:ilvl="0">
       <w:start w:val="1"/>
       <w:numFmt w:val="bullet"/>
@@ -12145,6 +13752,9 @@
   </w:num>
   <w:num w:numId="12">
     <w:abstractNumId w:val="1"/>
+  </w:num>
+  <w:num w:numId="13">
+    <w:abstractNumId w:val="12"/>
   </w:num>
 </w:numbering>
 </file>

</xml_diff>